<commit_message>
test: implement complete CodeceptJS E2E test suite for frontend and fix SRS generation script
</commit_message>
<xml_diff>
--- a/docs/SRS_Eyewear_System.docx
+++ b/docs/SRS_Eyewear_System.docx
@@ -8375,7 +8375,7 @@
                 <w:rFonts w:ascii="Arial" w:hAnsi="Arial"/>
                 <w:sz w:val="18"/>
               </w:rPr>
-              <w:t>Auth Module</w:t>
+              <w:t>ESQ-1: Auth Module</w:t>
             </w:r>
           </w:p>
         </w:tc>
@@ -8396,7 +8396,7 @@
                 <w:rFonts w:ascii="Arial" w:hAnsi="Arial"/>
                 <w:sz w:val="18"/>
               </w:rPr>
-              <w:t>Login, Register, Token Authentication, Logout, Forgot Password, Profile, Change Password, Role Authorization</w:t>
+              <w:t>Login, Register, User Profile</w:t>
             </w:r>
           </w:p>
         </w:tc>
@@ -8419,7 +8419,7 @@
                 <w:rFonts w:ascii="Arial" w:hAnsi="Arial"/>
                 <w:sz w:val="18"/>
               </w:rPr>
-              <w:t>Product Module</w:t>
+              <w:t>ESQ-2: Product Module</w:t>
             </w:r>
           </w:p>
         </w:tc>
@@ -8440,7 +8440,7 @@
                 <w:rFonts w:ascii="Arial" w:hAnsi="Arial"/>
                 <w:sz w:val="18"/>
               </w:rPr>
-              <w:t>Product Listing, Detail, Search, Filtering, Category, Product CRUD, Inventory, Image Handling</w:t>
+              <w:t>Product Catalog, Product Details</w:t>
             </w:r>
           </w:p>
         </w:tc>
@@ -8463,7 +8463,7 @@
                 <w:rFonts w:ascii="Arial" w:hAnsi="Arial"/>
                 <w:sz w:val="18"/>
               </w:rPr>
-              <w:t>Cart Module</w:t>
+              <w:t>ESQ-3: Cart &amp; Checkout</w:t>
             </w:r>
           </w:p>
         </w:tc>
@@ -8484,7 +8484,7 @@
                 <w:rFonts w:ascii="Arial" w:hAnsi="Arial"/>
                 <w:sz w:val="18"/>
               </w:rPr>
-              <w:t>Add To Cart, Remove From Cart, Update Quantity, Cart Total, Checkout Validation, Coupon Logic, Shipping Fee</w:t>
+              <w:t>Manage Shopping Cart, Checkout Process</w:t>
             </w:r>
           </w:p>
         </w:tc>
@@ -8507,7 +8507,7 @@
                 <w:rFonts w:ascii="Arial" w:hAnsi="Arial"/>
                 <w:sz w:val="18"/>
               </w:rPr>
-              <w:t>Payment Module</w:t>
+              <w:t>ESQ-4: Order &amp; Payment</w:t>
             </w:r>
           </w:p>
         </w:tc>
@@ -8528,7 +8528,7 @@
                 <w:rFonts w:ascii="Arial" w:hAnsi="Arial"/>
                 <w:sz w:val="18"/>
               </w:rPr>
-              <w:t>VNPay Integration, Payment Validation, Order Creation, Order History, Refund API, Transaction Logging</w:t>
+              <w:t>Process Order Payment, Confirm Payment (Staff), View Order History</w:t>
             </w:r>
           </w:p>
         </w:tc>
@@ -8551,7 +8551,7 @@
                 <w:rFonts w:ascii="Arial" w:hAnsi="Arial"/>
                 <w:sz w:val="18"/>
               </w:rPr>
-              <w:t>Operations Module</w:t>
+              <w:t>ESQ-5: Operations</w:t>
             </w:r>
           </w:p>
         </w:tc>
@@ -8572,7 +8572,51 @@
                 <w:rFonts w:ascii="Arial" w:hAnsi="Arial"/>
                 <w:sz w:val="18"/>
               </w:rPr>
-              <w:t>Admin Dashboard, User Management, Revenue Analytics, Product Statistics, Notification System, Report Export</w:t>
+              <w:t>Inventory Management</w:t>
+            </w:r>
+          </w:p>
+        </w:tc>
+      </w:tr>
+      <w:tr>
+        <w:tc>
+          <w:tcPr>
+            <w:tcW w:type="dxa" w:w="2448"/>
+            <w:tcMar>
+              <w:top w:w="80" w:type="dxa"/>
+              <w:start w:w="120" w:type="dxa"/>
+              <w:bottom w:w="80" w:type="dxa"/>
+              <w:end w:w="120" w:type="dxa"/>
+            </w:tcMar>
+            <w:vAlign w:val="center"/>
+          </w:tcPr>
+          <w:p>
+            <w:r>
+              <w:rPr>
+                <w:rFonts w:ascii="Arial" w:hAnsi="Arial"/>
+                <w:sz w:val="18"/>
+              </w:rPr>
+              <w:t>ESQ-6: Dashboard &amp; Admin</w:t>
+            </w:r>
+          </w:p>
+        </w:tc>
+        <w:tc>
+          <w:tcPr>
+            <w:tcW w:type="dxa" w:w="6912"/>
+            <w:tcMar>
+              <w:top w:w="80" w:type="dxa"/>
+              <w:start w:w="120" w:type="dxa"/>
+              <w:bottom w:w="80" w:type="dxa"/>
+              <w:end w:w="120" w:type="dxa"/>
+            </w:tcMar>
+            <w:vAlign w:val="center"/>
+          </w:tcPr>
+          <w:p>
+            <w:r>
+              <w:rPr>
+                <w:rFonts w:ascii="Arial" w:hAnsi="Arial"/>
+                <w:sz w:val="18"/>
+              </w:rPr>
+              <w:t>Sales Dashboard, User Management</w:t>
             </w:r>
           </w:p>
         </w:tc>

</xml_diff>